<commit_message>
Rework Module 5 assignment to the stated specification
The previous version missed part of Part 2: the assignment asks for a
plan based on the PDP for developing the product, and the draft only
covered securing Phase 0 approval without walking the phases.

- Part 2 now traverses Phase 0 through Phase 5 with per-phase
  deliverables and gates, keeping the boss-pitch framing and the
  critical pre-Phase-0 information
- Part 1 unchanged in substance, tightened to the three required
  elements: application space, initial impressions, opportunities
- Paragraph counts verified against the spec: Part 1 = 3, Part 2 = 4
- Removed figures and decision trees, which the assignment does not
  request; retained under not-submitted/ for reference

Co-Authored-By: Claude Opus 5 <noreply@anthropic.com>
Claude-Session: https://claude.ai/code/session_01Pr1KZUwJKr1SG7VKRTVf7C
</commit_message>
<xml_diff>
--- a/module-05/Module_05_Assignment_Topic_and_PDP_Plan.docx
+++ b/module-05/Module_05_Assignment_Topic_and_PDP_Plan.docx
@@ -5,7 +5,7 @@
     <w:p>
       <w:pPr>
         <w:keepNext/>
-        <w:spacing w:before="0" w:after="80"/>
+        <w:spacing w:before="0" w:after="100"/>
       </w:pPr>
       <w:r>
         <w:rPr>
@@ -19,24 +19,21 @@
     </w:p>
     <w:p>
       <w:pPr>
-        <w:spacing w:after="220"/>
+        <w:spacing w:after="260"/>
         <w:jc w:val="center"/>
       </w:pPr>
       <w:r>
         <w:rPr>
           <w:rFonts w:ascii="Arial" w:hAnsi="Arial"/>
-          <w:sz w:val="19"/>
+          <w:sz w:val="20"/>
         </w:rPr>
-        <w:t>585.617 Rehabilitation Engineering  |  Module 5 Assignment  |  [Your Name]  |  [Date]</w:t>
+        <w:t>585.617 Rehabilitation Engineering  |  [Your Name]  |  [Date]</w:t>
       </w:r>
     </w:p>
     <w:p>
       <w:pPr>
         <w:keepNext/>
-        <w:spacing w:before="220" w:after="80"/>
-        <w:pBdr>
-          <w:bottom w:val="single" w:sz="6" w:space="1" w:color="999999"/>
-        </w:pBdr>
+        <w:spacing w:before="80" w:after="100"/>
       </w:pPr>
       <w:r>
         <w:rPr>
@@ -45,19 +42,19 @@
           <w:color w:val="1F3B73"/>
           <w:sz w:val="23"/>
         </w:rPr>
-        <w:t>Part 1 — Project Topic Selection</w:t>
+        <w:t>Part 1 — Project Topic</w:t>
       </w:r>
     </w:p>
     <w:p>
       <w:pPr>
-        <w:spacing w:after="140"/>
+        <w:spacing w:after="180"/>
         <w:jc w:val="both"/>
       </w:pPr>
       <w:r>
         <w:rPr>
           <w:rFonts w:ascii="Arial" w:hAnsi="Arial"/>
         </w:rPr>
-        <w:t xml:space="preserve">I have selected the </w:t>
+        <w:t xml:space="preserve">For my semester project I have selected the </w:t>
       </w:r>
       <w:r>
         <w:rPr>
@@ -70,161 +67,44 @@
         <w:rPr>
           <w:rFonts w:ascii="Arial" w:hAnsi="Arial"/>
         </w:rPr>
-        <w:t xml:space="preserve"> topic from the provided list and refined it, since as written it names an application domain rather than a problem. Figure 1 records the narrowing. I excluded power wheelchair users, because a powered base already supplies much of the reaction mass and traction that make this problem hard; I excluded users with limited upper-limb function, because for them the governing difficulty is actuating the tool rather than reacting its forces, which is a genuinely different design problem; and I excluded ride-on equipment and unpowered hand tools, the first because commercial adaptations already exist and the second because there is no reaction-force problem to solve. What remains is the scoped application space: </w:t>
+        <w:t xml:space="preserve"> topic and refined its scope, since as listed it names an application domain rather than a problem. I narrowed it in three ways. The user population is manual wheelchair users with full upper-limb function: a powered chair already supplies much of the reaction mass and traction that make this problem difficult, and users with limited upper-limb function face a different governing problem, which is actuating the tool rather than reacting its forces. The task class is handheld powered tools — string trimmers, edgers, hedge trimmers and debris blowers — because ride-on equipment already has commercial adaptations and unpowered hand tools generate no meaningful reaction forces. The operating environment is residential turf, which is soft, uneven and frequently sloped. The resulting application space is </w:t>
       </w:r>
       <w:r>
         <w:rPr>
           <w:rFonts w:ascii="Arial" w:hAnsi="Arial"/>
           <w:b/>
         </w:rPr>
-        <w:t>independent residential yard maintenance by manual wheelchair users with full upper-limb function, for tasks that require a handheld powered tool — string trimming, edging, hedge trimming, debris blowing — performed on soft, uneven and frequently sloped turf.</w:t>
+        <w:t>independent residential yard maintenance by manual wheelchair users with full upper-limb function, using handheld powered tools on unimproved ground.</w:t>
       </w:r>
     </w:p>
     <w:p>
       <w:pPr>
-        <w:keepNext/>
-        <w:spacing w:before="140"/>
-        <w:jc w:val="center"/>
-      </w:pPr>
-      <w:r>
-        <w:drawing>
-          <wp:inline xmlns:a="http://schemas.openxmlformats.org/drawingml/2006/main" xmlns:pic="http://schemas.openxmlformats.org/drawingml/2006/picture">
-            <wp:extent cx="5669280" cy="3801179"/>
-            <wp:docPr id="1" name="Picture 1"/>
-            <wp:cNvGraphicFramePr>
-              <a:graphicFrameLocks noChangeAspect="1"/>
-            </wp:cNvGraphicFramePr>
-            <a:graphic>
-              <a:graphicData uri="http://schemas.openxmlformats.org/drawingml/2006/picture">
-                <pic:pic>
-                  <pic:nvPicPr>
-                    <pic:cNvPr id="0" name="fig1_scope.png"/>
-                    <pic:cNvPicPr/>
-                  </pic:nvPicPr>
-                  <pic:blipFill>
-                    <a:blip r:embed="rId9"/>
-                    <a:stretch>
-                      <a:fillRect/>
-                    </a:stretch>
-                  </pic:blipFill>
-                  <pic:spPr>
-                    <a:xfrm>
-                      <a:off x="0" y="0"/>
-                      <a:ext cx="5669280" cy="3801179"/>
-                    </a:xfrm>
-                    <a:prstGeom prst="rect"/>
-                  </pic:spPr>
-                </pic:pic>
-              </a:graphicData>
-            </a:graphic>
-          </wp:inline>
-        </w:drawing>
-      </w:r>
-    </w:p>
-    <w:p>
-      <w:pPr>
-        <w:spacing w:after="220"/>
-        <w:jc w:val="center"/>
-      </w:pPr>
-      <w:r>
-        <w:rPr>
-          <w:rFonts w:ascii="Arial" w:hAnsi="Arial"/>
-          <w:b/>
-          <w:sz w:val="17"/>
-        </w:rPr>
-        <w:t>Figure 1.</w:t>
-      </w:r>
-      <w:r>
-        <w:rPr>
-          <w:rFonts w:ascii="Arial" w:hAnsi="Arial"/>
-          <w:sz w:val="17"/>
-        </w:rPr>
-        <w:t xml:space="preserve"> Narrowing the listed topic into a scoped application space. Greyed branches are excluded, with the reason for exclusion stated.</w:t>
-      </w:r>
-    </w:p>
-    <w:p>
-      <w:pPr>
-        <w:spacing w:after="140"/>
+        <w:spacing w:after="180"/>
         <w:jc w:val="both"/>
       </w:pPr>
       <w:r>
         <w:rPr>
           <w:rFonts w:ascii="Arial" w:hAnsi="Arial"/>
         </w:rPr>
-        <w:t>The problem is that handheld powered yard tools are built around an assumption that stays invisible until it fails: a standing operator. A standing user reacts tool torque through a two-handed stance and body weight, repositions by stepping, and changes working height by bending or kneeling. A seated manual wheelchair user loses all three at once. The chair becomes the only available reaction mass, and it is a mass with a defined and fairly narrow stability envelope — the manual wheelchair lecture made the point that pitch stability is set by axle position relative to the centre of mass, and that moving the axle forward to cut rolling resistance buys that reduction at the direct cost of making the chair easier to tip. More fundamentally, manual propulsion is itself a two-handed cyclic task, so holding a tool consumes exactly the limbs that mobility requires: the user cannot drive and work at the same time. Layer on the terrain — manual chairs propel poorly on grass and small casters catch on soft ground — and the problem resolves into the simultaneous management of reaction forces, workspace and mobility. That combination is why I think there is real engineering in it rather than a purchasing decision.</w:t>
+        <w:t>My initial impression is that handheld powered yard tools are designed around an assumption that stays invisible until it fails: a standing operator. A standing user reacts tool torque through a two-handed stance and body weight, repositions by stepping, and changes working height by bending or kneeling. A seated manual wheelchair user loses all three at once. The chair becomes the only available reaction mass, and it is a mass with a defined and fairly narrow stability envelope — the manual wheelchair lecture made the point that pitch stability is governed by axle position relative to the centre of mass, and that moving the axle forward to reduce rolling resistance directly reduces how hard it is to tip. The sharper constraint is that manual propulsion is itself a two-handed, cyclic task, so holding a tool occupies exactly the limbs that mobility requires and the user cannot propel and work at the same time. Terrain compounds both problems, since manual chairs propel poorly on grass and small casters catch on soft ground. The problem is therefore the simultaneous management of reaction forces, working envelope and mobility, and I suspect it is the coupling among the three, rather than any one of them, that has kept it unsolved.</w:t>
       </w:r>
     </w:p>
     <w:p>
       <w:pPr>
-        <w:spacing w:after="140"/>
+        <w:spacing w:after="180"/>
         <w:jc w:val="both"/>
       </w:pPr>
       <w:r>
         <w:rPr>
           <w:rFonts w:ascii="Arial" w:hAnsi="Arial"/>
         </w:rPr>
-        <w:t xml:space="preserve">I am deliberately </w:t>
-      </w:r>
-      <w:r>
-        <w:rPr>
-          <w:rFonts w:ascii="Arial" w:hAnsi="Arial"/>
-          <w:b/>
-        </w:rPr>
-        <w:t>not</w:t>
-      </w:r>
-      <w:r>
-        <w:rPr>
-          <w:rFonts w:ascii="Arial" w:hAnsi="Arial"/>
-        </w:rPr>
-        <w:t xml:space="preserve"> proposing a solution at this stage; the concept belongs in Phase 1, after needs are gathered. What I can identify now are the three parameters where innovation is most likely to be required and where a prototype could be meaningfully tested. </w:t>
-      </w:r>
-      <w:r>
-        <w:rPr>
-          <w:rFonts w:ascii="Arial" w:hAnsi="Arial"/>
-          <w:b/>
-        </w:rPr>
-        <w:t>P1, the reaction-force path and stability margin</w:t>
-      </w:r>
-      <w:r>
-        <w:rPr>
-          <w:rFonts w:ascii="Arial" w:hAnsi="Arial"/>
-        </w:rPr>
-        <w:t xml:space="preserve">: how tool loads are routed into the chair frame without pushing the occupied system past its ISO 7176-1 static and ISO 7176-2 dynamic limits on a grade [4]. </w:t>
-      </w:r>
-      <w:r>
-        <w:rPr>
-          <w:rFonts w:ascii="Arial" w:hAnsi="Arial"/>
-          <w:b/>
-        </w:rPr>
-        <w:t>P2, the seated reach and workspace envelope</w:t>
-      </w:r>
-      <w:r>
-        <w:rPr>
-          <w:rFonts w:ascii="Arial" w:hAnsi="Arial"/>
-        </w:rPr>
-        <w:t xml:space="preserve">: delivering a tool to ground level and to a hedge at height from a fixed seated anthropometry. </w:t>
-      </w:r>
-      <w:r>
-        <w:rPr>
-          <w:rFonts w:ascii="Arial" w:hAnsi="Arial"/>
-          <w:b/>
-        </w:rPr>
-        <w:t>P3, mobility while equipped</w:t>
-      </w:r>
-      <w:r>
-        <w:rPr>
-          <w:rFonts w:ascii="Arial" w:hAnsi="Arial"/>
-        </w:rPr>
-        <w:t>: how the tool is stowed or decoupled to return the hands to the handrims, and how it releases under fault. Each is mechanical, each is measurable, and each is testable in the spring with instrumented load measurement and tip-angle testing on a ramp. The scope is bounded in the direction the Design Project Description asks for — this is an interface and mounting problem, not a new tool and not a new wheelchair — which keeps it clear of topics too complex to prototype inside a two-semester course.</w:t>
+        <w:t>I am deliberately not proposing a solution at this stage, since concept generation belongs in Phase 1 after needs are gathered. What I can identify are the areas where innovation is most likely to be required and where a prototype could be meaningfully tested. The first is the reaction-force path and the stability margin it leaves: how tool loads are routed into the chair without pushing the occupied system past its ISO 7176-1 static and ISO 7176-2 dynamic limits on a grade. The second is the seated reach and working envelope, which has to deliver a tool both to ground level and to a hedge at height from a fixed seated anthropometry. The third is mobility while equipped — how the tool is stowed or decoupled to return the hands to the handrims, and how it releases under fault. Each of these is mechanical, each is measurable, and each can be prototyped and tested in the spring using ramp tip-angle testing and instrumented load measurement. The scope is also bounded in the direction the Design Project Description asks for: this is an interface and mounting problem, not a new tool and not a new wheelchair.</w:t>
       </w:r>
     </w:p>
     <w:p>
       <w:pPr>
         <w:keepNext/>
-        <w:spacing w:before="220" w:after="80"/>
-        <w:pBdr>
-          <w:bottom w:val="single" w:sz="6" w:space="1" w:color="999999"/>
-        </w:pBdr>
+        <w:spacing w:before="240" w:after="100"/>
       </w:pPr>
       <w:r>
         <w:rPr>
@@ -233,188 +113,121 @@
           <w:color w:val="1F3B73"/>
           <w:sz w:val="23"/>
         </w:rPr>
-        <w:t>Part 2 — High-Level Plan for Phase 0 Approval</w:t>
+        <w:t>Part 2 — Development Plan Based on the Product Development Process</w:t>
       </w:r>
     </w:p>
     <w:p>
       <w:pPr>
-        <w:spacing w:after="140"/>
+        <w:spacing w:after="180"/>
         <w:jc w:val="both"/>
       </w:pPr>
       <w:r>
         <w:rPr>
           <w:rFonts w:ascii="Arial" w:hAnsi="Arial"/>
         </w:rPr>
-        <w:t>The request I would put to my boss is not approval of a design. It is approval to spend Phase 0 resources establishing whether a design is worth attempting at all. Following the six-phase product development process from the module lecture — Planning, Concept Development, System-level Design, Detail Design, Testing and Refinement, Production Ramp-up — Phase 0 is where investigation, scoping and engineering assessment happen, and Phase 1 is where customer needs are converted into a Product Design Specification [1], [2], [5]. The information a sponsor needs before releasing Phase 0 funds therefore concerns need, market, risk and resources, and deliberately excludes a concept. Presenting a concept at this point would be the specific failure mode the module overview warns about: beginning by generating ideas and building, rather than establishing that the right problem has been identified.</w:t>
+        <w:t>What I would bring to my boss is a request to begin Phase 0, not a request to approve a design. Before releasing Phase 0 resources I would expect to provide six things: a defensible estimate of the served population, which is manual wheelchair users who own or maintain a yard and is a much smaller number than the wheelchair population generally; evidence that the need is real and unmet, gathered from interviews with at least eight manual wheelchair users who currently do yard work or have given it up, together with two or three occupational therapists or assistive technology professionals; a competitive and patent landscape covering adaptive gardening tools, tool-holding arms and wheelchair-mounted accessories, with a preliminary freedom-to-operate view; a regulatory determination; a funding model; and a resourced schedule with stated kill criteria. The regulatory and funding pair matters most, because it sets the economics before any engineering begins. The product makes no medical claim, so it is not an FDA-regulated device and is governed instead by power-tool safety standards and by ISO 7176 where it meets the chair. By the same token it will not satisfy a medical-necessity test, so there is no reimbursement path and the product must be cash-pay or nonprofit-subsidised. That fixes a price ceiling before a concept exists, and the price ceiling constrains the bill of materials.</w:t>
       </w:r>
     </w:p>
     <w:p>
       <w:pPr>
-        <w:spacing w:after="140"/>
+        <w:spacing w:after="180"/>
         <w:jc w:val="both"/>
       </w:pPr>
       <w:r>
         <w:rPr>
           <w:rFonts w:ascii="Arial" w:hAnsi="Arial"/>
+          <w:b/>
         </w:rPr>
-        <w:t>The first block of information is the user and the market. I would bring a defensible estimate of the served population — manual wheelchair users who own or maintain a yard, which is a far smaller number than the wheelchair-user population and needs to be stated honestly rather than inflated — together with a validation plan: structured interviews with at least eight manual wheelchair users who currently do yard work or have given it up, plus two or three occupational therapists or assistive technology professionals, and at least two observational visits to see what people actually do and what workarounds already exist. Alongside this I would bring a competitive and intellectual-property landscape covering existing adaptive gardening tools, tool-holding arms and wheelchair-mounted accessories, with a preliminary freedom-to-operate assessment. The deliverable from this block is a decision, not a product: whether the need is real, unmet, and attributable to the specific population I have scoped.</w:t>
+        <w:t>Phase 0, Planning</w:t>
+      </w:r>
+      <w:r>
+        <w:rPr>
+          <w:rFonts w:ascii="Arial" w:hAnsi="Arial"/>
+        </w:rPr>
+        <w:t xml:space="preserve">, is investigation, scoping and engineering assessment. Its deliverables are the validated needs list, the served-population estimate, the landscape report, the regulatory memo, a preliminary hazard list covering a powered cutting tool operated beside an occupied chair, and a resourced plan for Phase 1. The exit gate is an evidence gate, not a design gate: is the need demonstrated, is the population large enough to justify tooling, does a feasible stability envelope appear to exist, is there freedom to operate, and is the budget within tolerance. </w:t>
+      </w:r>
+      <w:r>
+        <w:rPr>
+          <w:rFonts w:ascii="Arial" w:hAnsi="Arial"/>
+          <w:b/>
+        </w:rPr>
+        <w:t>Phase 1, Concept Development</w:t>
+      </w:r>
+      <w:r>
+        <w:rPr>
+          <w:rFonts w:ascii="Arial" w:hAnsi="Arial"/>
+        </w:rPr>
+        <w:t>, converts customer needs into a Product Design Specification and generates and screens concepts against it. The assistive-technology considerations from the lecture bear directly here — user-centred design, the accessibility ecosystem, and stigma and aesthetics — and the last of those deserves more weight than it would for a generic tool accessory, because a device that marks its user as needing help is a device that ends up left in the shed. Phase 1 exits with an approved PDS and a selected concept.</w:t>
       </w:r>
     </w:p>
     <w:p>
       <w:pPr>
-        <w:spacing w:after="140"/>
+        <w:spacing w:after="180"/>
         <w:jc w:val="both"/>
       </w:pPr>
       <w:r>
         <w:rPr>
           <w:rFonts w:ascii="Arial" w:hAnsi="Arial"/>
+          <w:b/>
         </w:rPr>
-        <w:t>The second block is the determination with the largest downstream consequence, and it is a business and regulatory question rather than a technical one. Figure 2 sets out the logic. My working assumption is the left-hand path: the product makes no medical claim, so it is not an FDA-regulated device, and it is governed instead by power-tool safety standards and by ISO 7176 where it interfaces with the chair, carrying product-liability rather than regulatory exposure. The corollary concerns funding. Yard maintenance will not satisfy a medical-necessity test — the wheelchair coverage policy discussed earlier in the course restricts reimbursement to mobility-related activities of daily living in customary locations within the home — so there is no third-party reimbursement path, and the product must be cash-pay, nonprofit-subsidised or open-source. That establishes a price ceiling before any concept exists, which in turn constrains the bill of materials. This is precisely the class of business consideration that has to surface before Phase 0, not be discovered in Phase 3 when the cost is already committed [3].</w:t>
+        <w:t>Phase 2, System-level Design</w:t>
+      </w:r>
+      <w:r>
+        <w:rPr>
+          <w:rFonts w:ascii="Arial" w:hAnsi="Arial"/>
+        </w:rPr>
+        <w:t xml:space="preserve">, fixes the architecture: how tool loads are routed into the chair frame, where the interface attaches, and how the assembly mounts and demounts. Ergonomics and anthropometrics, adaptability across chair geometries, and safety and reliability are the governing concerns, and prototyping begins here. For this project the critical early experiment is a ramp tip-angle test under a representative tool load, because if the stability envelope cannot be met then the architecture is wrong and it is far cheaper to discover that in Phase 2 than later. </w:t>
+      </w:r>
+      <w:r>
+        <w:rPr>
+          <w:rFonts w:ascii="Arial" w:hAnsi="Arial"/>
+          <w:b/>
+        </w:rPr>
+        <w:t>Phase 3, Detail Design</w:t>
+      </w:r>
+      <w:r>
+        <w:rPr>
+          <w:rFonts w:ascii="Arial" w:hAnsi="Arial"/>
+        </w:rPr>
+        <w:t>, resolves components, materials and tolerances, and is where compliance and standards, materials and hygiene, and the tension between customisation and scalability get settled. That tension is real for this product: wheelchairs vary enough in frame geometry that a single universal mount may not exist, and choosing between a family of fittings and one adjustable fitting is a Phase 3 decision with large manufacturing consequences.</w:t>
+      </w:r>
+    </w:p>
+    <w:p>
+      <w:pPr>
+        <w:spacing w:after="180"/>
+        <w:jc w:val="both"/>
+      </w:pPr>
+      <w:r>
+        <w:rPr>
+          <w:rFonts w:ascii="Arial" w:hAnsi="Arial"/>
+          <w:b/>
+        </w:rPr>
+        <w:t>Phase 4, Testing and Refinement</w:t>
+      </w:r>
+      <w:r>
+        <w:rPr>
+          <w:rFonts w:ascii="Arial" w:hAnsi="Arial"/>
+        </w:rPr>
+        <w:t xml:space="preserve">, verifies the design against the PDS and validates it with users. Trials with the target population and long-term reliability testing are both necessary, but I would argue for extending the phase past conventional verification, because the endpoint that actually matters for assistive technology is continued voluntary use: a device can meet every specification and still be abandoned. </w:t>
+      </w:r>
+      <w:r>
+        <w:rPr>
+          <w:rFonts w:ascii="Arial" w:hAnsi="Arial"/>
+          <w:b/>
+        </w:rPr>
+        <w:t>Phase 5, Production Ramp-up</w:t>
+      </w:r>
+      <w:r>
+        <w:rPr>
+          <w:rFonts w:ascii="Arial" w:hAnsi="Arial"/>
+        </w:rPr>
+        <w:t>, is small-batch manufacture rather than mass production at this volume, with user training and a support and spares channel treated as deliverables rather than afterthoughts, since a user whose device fails has no substitute. Overall I would propose Phase 0 at roughly eight weeks of part-time effort with a formal gate before any Phase 1 money is committed. The argument for that discipline comes from the design reading: by the close of conceptual design the great majority of total product cost is already committed even though almost none of it has been spent, so a well-evidenced decision to stop is inexpensive now and very expensive later.</w:t>
       </w:r>
     </w:p>
     <w:p>
       <w:pPr>
         <w:keepNext/>
-        <w:spacing w:before="140"/>
-        <w:jc w:val="center"/>
-      </w:pPr>
-      <w:r>
-        <w:drawing>
-          <wp:inline xmlns:a="http://schemas.openxmlformats.org/drawingml/2006/main" xmlns:pic="http://schemas.openxmlformats.org/drawingml/2006/picture">
-            <wp:extent cx="5669280" cy="4131481"/>
-            <wp:docPr id="2" name="Picture 2"/>
-            <wp:cNvGraphicFramePr>
-              <a:graphicFrameLocks noChangeAspect="1"/>
-            </wp:cNvGraphicFramePr>
-            <a:graphic>
-              <a:graphicData uri="http://schemas.openxmlformats.org/drawingml/2006/picture">
-                <pic:pic>
-                  <pic:nvPicPr>
-                    <pic:cNvPr id="0" name="fig2_regulatory.png"/>
-                    <pic:cNvPicPr/>
-                  </pic:nvPicPr>
-                  <pic:blipFill>
-                    <a:blip r:embed="rId10"/>
-                    <a:stretch>
-                      <a:fillRect/>
-                    </a:stretch>
-                  </pic:blipFill>
-                  <pic:spPr>
-                    <a:xfrm>
-                      <a:off x="0" y="0"/>
-                      <a:ext cx="5669280" cy="4131481"/>
-                    </a:xfrm>
-                    <a:prstGeom prst="rect"/>
-                  </pic:spPr>
-                </pic:pic>
-              </a:graphicData>
-            </a:graphic>
-          </wp:inline>
-        </w:drawing>
-      </w:r>
-    </w:p>
-    <w:p>
-      <w:pPr>
-        <w:spacing w:after="220"/>
-        <w:jc w:val="center"/>
-      </w:pPr>
-      <w:r>
-        <w:rPr>
-          <w:rFonts w:ascii="Arial" w:hAnsi="Arial"/>
-          <w:b/>
-          <w:sz w:val="17"/>
-        </w:rPr>
-        <w:t>Figure 2.</w:t>
-      </w:r>
-      <w:r>
-        <w:rPr>
-          <w:rFonts w:ascii="Arial" w:hAnsi="Arial"/>
-          <w:sz w:val="17"/>
-        </w:rPr>
-        <w:t xml:space="preserve"> Regulatory and funding pathway determination. The branch taken here fixes the governing standards, the liability posture, and the achievable target price.</w:t>
-      </w:r>
-    </w:p>
-    <w:p>
-      <w:pPr>
-        <w:spacing w:after="140"/>
-        <w:jc w:val="both"/>
-      </w:pPr>
-      <w:r>
-        <w:rPr>
-          <w:rFonts w:ascii="Arial" w:hAnsi="Arial"/>
-        </w:rPr>
-        <w:t>The third block is resources and the exit criteria. I would propose Phase 0 at roughly eight weeks of part-time effort, with deliverables comprising a validated needs list, a served-population estimate, the landscape and freedom-to-operate report, a regulatory determination memo, a preliminary hazard list covering a powered cutting tool operated near an occupied chair, and a resourced Phase 1 plan. Critically, I would state the exit gate in advance rather than negotiating it afterwards. Figure 3 gives the gate logic; all five questions are evidence questions, and none of them asks what the device will look like. I would also state the kill criteria explicitly, because the most valuable outcome of Phase 0 can be a well-evidenced decision not to proceed. The cost-committed curve from the engineering design material makes the argument for me: by the close of conceptual design roughly three-quarters of total product cost is already locked in while almost none of it has been spent, so a disciplined stop at the Phase 0 gate is cheap, and the same decision taken in Phase 3 is not [3].</w:t>
-      </w:r>
-    </w:p>
-    <w:p>
-      <w:pPr>
-        <w:keepNext/>
-        <w:spacing w:before="140"/>
-        <w:jc w:val="center"/>
-      </w:pPr>
-      <w:r>
-        <w:drawing>
-          <wp:inline xmlns:a="http://schemas.openxmlformats.org/drawingml/2006/main" xmlns:pic="http://schemas.openxmlformats.org/drawingml/2006/picture">
-            <wp:extent cx="5349240" cy="3821616"/>
-            <wp:docPr id="3" name="Picture 3"/>
-            <wp:cNvGraphicFramePr>
-              <a:graphicFrameLocks noChangeAspect="1"/>
-            </wp:cNvGraphicFramePr>
-            <a:graphic>
-              <a:graphicData uri="http://schemas.openxmlformats.org/drawingml/2006/picture">
-                <pic:pic>
-                  <pic:nvPicPr>
-                    <pic:cNvPr id="0" name="fig3_gate.png"/>
-                    <pic:cNvPicPr/>
-                  </pic:nvPicPr>
-                  <pic:blipFill>
-                    <a:blip r:embed="rId11"/>
-                    <a:stretch>
-                      <a:fillRect/>
-                    </a:stretch>
-                  </pic:blipFill>
-                  <pic:spPr>
-                    <a:xfrm>
-                      <a:off x="0" y="0"/>
-                      <a:ext cx="5349240" cy="3821616"/>
-                    </a:xfrm>
-                    <a:prstGeom prst="rect"/>
-                  </pic:spPr>
-                </pic:pic>
-              </a:graphicData>
-            </a:graphic>
-          </wp:inline>
-        </w:drawing>
-      </w:r>
-    </w:p>
-    <w:p>
-      <w:pPr>
-        <w:spacing w:after="220"/>
-        <w:jc w:val="center"/>
-      </w:pPr>
-      <w:r>
-        <w:rPr>
-          <w:rFonts w:ascii="Arial" w:hAnsi="Arial"/>
-          <w:b/>
-          <w:sz w:val="17"/>
-        </w:rPr>
-        <w:t>Figure 3.</w:t>
-      </w:r>
-      <w:r>
-        <w:rPr>
-          <w:rFonts w:ascii="Arial" w:hAnsi="Arial"/>
-          <w:sz w:val="17"/>
-        </w:rPr>
-        <w:t xml:space="preserve"> Phase 0 exit gate. Each branch is an evidence question with a defined failure action; no concept is selected at this gate.</w:t>
-      </w:r>
-    </w:p>
-    <w:p>
-      <w:pPr>
-        <w:keepNext/>
-        <w:spacing w:before="200" w:after="80"/>
-        <w:pBdr>
-          <w:bottom w:val="single" w:sz="6" w:space="1" w:color="999999"/>
-        </w:pBdr>
+        <w:spacing w:before="240" w:after="100"/>
       </w:pPr>
       <w:r>
         <w:rPr>
@@ -428,132 +241,76 @@
     </w:p>
     <w:p>
       <w:pPr>
-        <w:spacing w:after="80"/>
-        <w:ind w:left="461" w:hanging="461"/>
+        <w:spacing w:after="100"/>
+        <w:ind w:left="504" w:hanging="504"/>
       </w:pPr>
       <w:r>
         <w:rPr>
           <w:rFonts w:ascii="Arial" w:hAnsi="Arial"/>
-          <w:sz w:val="18"/>
+          <w:sz w:val="19"/>
         </w:rPr>
-        <w:t xml:space="preserve">[1] Dieter, G. E. and Schmid, L. C. </w:t>
+        <w:t xml:space="preserve">Dieter, G. E. and Schmid, L. C. </w:t>
       </w:r>
       <w:r>
         <w:rPr>
           <w:rFonts w:ascii="Arial" w:hAnsi="Arial"/>
           <w:i/>
-          <w:sz w:val="18"/>
+          <w:sz w:val="19"/>
         </w:rPr>
         <w:t>Engineering Design</w:t>
       </w:r>
       <w:r>
         <w:rPr>
           <w:rFonts w:ascii="Arial" w:hAnsi="Arial"/>
-          <w:sz w:val="18"/>
+          <w:sz w:val="19"/>
         </w:rPr>
         <w:t>, 5th ed. New York: McGraw-Hill, 2013. Chapter 2, Sections 2.1–2.4 and 2.6.</w:t>
       </w:r>
     </w:p>
     <w:p>
       <w:pPr>
-        <w:spacing w:after="80"/>
-        <w:ind w:left="461" w:hanging="461"/>
+        <w:spacing w:after="100"/>
+        <w:ind w:left="504" w:hanging="504"/>
       </w:pPr>
       <w:r>
         <w:rPr>
           <w:rFonts w:ascii="Arial" w:hAnsi="Arial"/>
-          <w:sz w:val="18"/>
+          <w:sz w:val="19"/>
         </w:rPr>
-        <w:t xml:space="preserve">[2] Ulrich, K. T. and Eppinger, S. D. </w:t>
+        <w:t>585.617 Rehabilitation Engineering, Module 5 lecture materials: "Product Development Process Overview" and "Considerations Specific to Assistive Technologies." Johns Hopkins University.</w:t>
+      </w:r>
+    </w:p>
+    <w:p>
+      <w:pPr>
+        <w:spacing w:after="100"/>
+        <w:ind w:left="504" w:hanging="504"/>
+      </w:pPr>
+      <w:r>
+        <w:rPr>
+          <w:rFonts w:ascii="Arial" w:hAnsi="Arial"/>
+          <w:sz w:val="19"/>
+        </w:rPr>
+        <w:t xml:space="preserve">International Organization for Standardization. ISO 7176 series, </w:t>
       </w:r>
       <w:r>
         <w:rPr>
           <w:rFonts w:ascii="Arial" w:hAnsi="Arial"/>
           <w:i/>
-          <w:sz w:val="18"/>
-        </w:rPr>
-        <w:t>Product Design and Development</w:t>
-      </w:r>
-      <w:r>
-        <w:rPr>
-          <w:rFonts w:ascii="Arial" w:hAnsi="Arial"/>
-          <w:sz w:val="18"/>
-        </w:rPr>
-        <w:t>. New York: McGraw-Hill.</w:t>
-      </w:r>
-    </w:p>
-    <w:p>
-      <w:pPr>
-        <w:spacing w:after="80"/>
-        <w:ind w:left="461" w:hanging="461"/>
-      </w:pPr>
-      <w:r>
-        <w:rPr>
-          <w:rFonts w:ascii="Arial" w:hAnsi="Arial"/>
-          <w:sz w:val="18"/>
-        </w:rPr>
-        <w:t xml:space="preserve">[3] Ullman, D. G. </w:t>
-      </w:r>
-      <w:r>
-        <w:rPr>
-          <w:rFonts w:ascii="Arial" w:hAnsi="Arial"/>
-          <w:i/>
-          <w:sz w:val="18"/>
-        </w:rPr>
-        <w:t>The Mechanical Design Process</w:t>
-      </w:r>
-      <w:r>
-        <w:rPr>
-          <w:rFonts w:ascii="Arial" w:hAnsi="Arial"/>
-          <w:sz w:val="18"/>
-        </w:rPr>
-        <w:t>, 4th ed. New York: McGraw-Hill, 2010.</w:t>
-      </w:r>
-    </w:p>
-    <w:p>
-      <w:pPr>
-        <w:spacing w:after="80"/>
-        <w:ind w:left="461" w:hanging="461"/>
-      </w:pPr>
-      <w:r>
-        <w:rPr>
-          <w:rFonts w:ascii="Arial" w:hAnsi="Arial"/>
-          <w:sz w:val="18"/>
-        </w:rPr>
-        <w:t xml:space="preserve">[4] International Organization for Standardization. ISO 7176 series, </w:t>
-      </w:r>
-      <w:r>
-        <w:rPr>
-          <w:rFonts w:ascii="Arial" w:hAnsi="Arial"/>
-          <w:i/>
-          <w:sz w:val="18"/>
+          <w:sz w:val="19"/>
         </w:rPr>
         <w:t>Wheelchairs</w:t>
       </w:r>
       <w:r>
         <w:rPr>
           <w:rFonts w:ascii="Arial" w:hAnsi="Arial"/>
-          <w:sz w:val="18"/>
+          <w:sz w:val="19"/>
         </w:rPr>
         <w:t xml:space="preserve"> — Part 1 (determination of static stability) and Part 2 (determination of dynamic stability of electric wheelchairs). Geneva: ISO.</w:t>
       </w:r>
     </w:p>
-    <w:p>
-      <w:pPr>
-        <w:spacing w:after="80"/>
-        <w:ind w:left="461" w:hanging="461"/>
-      </w:pPr>
-      <w:r>
-        <w:rPr>
-          <w:rFonts w:ascii="Arial" w:hAnsi="Arial"/>
-          <w:sz w:val="18"/>
-        </w:rPr>
-        <w:t>[5] 585.617 Rehabilitation Engineering, Module 5 lecture materials: "Product Development Process Overview" and "Considerations Specific to Assistive Technologies." Johns Hopkins University.</w:t>
-      </w:r>
-    </w:p>
     <w:sectPr>
       <w:pgSz w:w="12240" w:h="15840"/>
-      <w:pgMar w:top="1224" w:right="1296" w:bottom="1224" w:left="1296" w:header="720" w:footer="720" w:gutter="0"/>
+      <w:pgMar w:top="1440" w:right="1440" w:bottom="1440" w:left="1440" w:header="720" w:footer="720" w:gutter="0"/>
       <w:cols w:space="720"/>
       <w:docGrid w:linePitch="360"/>
     </w:sectPr>
@@ -925,11 +682,11 @@
     <w:qFormat/>
     <w:rsid w:val="00FC693F"/>
     <w:pPr>
-      <w:spacing w:after="140" w:line="259" w:lineRule="auto"/>
+      <w:spacing w:after="180" w:line="264" w:lineRule="auto"/>
     </w:pPr>
     <w:rPr>
       <w:rFonts w:ascii="Arial" w:hAnsi="Arial"/>
-      <w:sz w:val="21"/>
+      <w:sz w:val="22"/>
     </w:rPr>
   </w:style>
   <w:style w:type="paragraph" w:styleId="Header">

</xml_diff>